<commit_message>
Christmas commit with updates
</commit_message>
<xml_diff>
--- a/Report.docx
+++ b/Report.docx
@@ -4,6 +4,9 @@
   <w:body>
     <w:p>
       <w:r>
+        <w:rPr>
+          <w:noProof/>
+        </w:rPr>
         <w:drawing>
           <wp:inline distT="0" distB="0" distL="0" distR="0" wp14:anchorId="04D190F1" wp14:editId="6BE378A9">
             <wp:extent cx="5940425" cy="3363595"/>
@@ -44,9 +47,9 @@
     <w:p/>
     <w:p>
       <w:r>
-        <w:t>Самые</w:t>
-      </w:r>
-      <w:r>
+        <w:rPr>
+          <w:noProof/>
+        </w:rPr>
         <w:drawing>
           <wp:inline distT="0" distB="0" distL="0" distR="0" wp14:anchorId="4FCC0908" wp14:editId="293C9BC3">
             <wp:extent cx="5940425" cy="4458970"/>
@@ -87,6 +90,127 @@
     <w:p>
       <w:r>
         <w:t>Самые популярные товары на каждой точке</w:t>
+      </w:r>
+    </w:p>
+    <w:p>
+      <w:pPr>
+        <w:rPr>
+          <w:noProof/>
+        </w:rPr>
+      </w:pPr>
+    </w:p>
+    <w:p>
+      <w:r>
+        <w:rPr>
+          <w:noProof/>
+        </w:rPr>
+        <w:lastRenderedPageBreak/>
+        <w:drawing>
+          <wp:inline distT="0" distB="0" distL="0" distR="0" wp14:anchorId="746CF815" wp14:editId="12FD102B">
+            <wp:extent cx="5585460" cy="5054915"/>
+            <wp:effectExtent l="0" t="0" r="0" b="0"/>
+            <wp:docPr id="5" name="Рисунок 5"/>
+            <wp:cNvGraphicFramePr>
+              <a:graphicFrameLocks xmlns:a="http://schemas.openxmlformats.org/drawingml/2006/main" noChangeAspect="1"/>
+            </wp:cNvGraphicFramePr>
+            <a:graphic xmlns:a="http://schemas.openxmlformats.org/drawingml/2006/main">
+              <a:graphicData uri="http://schemas.openxmlformats.org/drawingml/2006/picture">
+                <pic:pic xmlns:pic="http://schemas.openxmlformats.org/drawingml/2006/picture">
+                  <pic:nvPicPr>
+                    <pic:cNvPr id="1" name=""/>
+                    <pic:cNvPicPr/>
+                  </pic:nvPicPr>
+                  <pic:blipFill rotWithShape="1">
+                    <a:blip r:embed="rId6"/>
+                    <a:srcRect l="19755" t="7526" r="31630" b="14253"/>
+                    <a:stretch/>
+                  </pic:blipFill>
+                  <pic:spPr bwMode="auto">
+                    <a:xfrm>
+                      <a:off x="0" y="0"/>
+                      <a:ext cx="5595351" cy="5063867"/>
+                    </a:xfrm>
+                    <a:prstGeom prst="rect">
+                      <a:avLst/>
+                    </a:prstGeom>
+                    <a:ln>
+                      <a:noFill/>
+                    </a:ln>
+                    <a:extLst>
+                      <a:ext uri="{53640926-AAD7-44D8-BBD7-CCE9431645EC}">
+                        <a14:shadowObscured xmlns:a14="http://schemas.microsoft.com/office/drawing/2010/main"/>
+                      </a:ext>
+                    </a:extLst>
+                  </pic:spPr>
+                </pic:pic>
+              </a:graphicData>
+            </a:graphic>
+          </wp:inline>
+        </w:drawing>
+      </w:r>
+    </w:p>
+    <w:p>
+      <w:r>
+        <w:t>Топ-10 самых популярных товаров</w:t>
+      </w:r>
+    </w:p>
+    <w:p>
+      <w:pPr>
+        <w:rPr>
+          <w:lang w:val="en-US"/>
+        </w:rPr>
+      </w:pPr>
+      <w:r>
+        <w:rPr>
+          <w:lang w:val="en-US"/>
+        </w:rPr>
+        <w:drawing>
+          <wp:inline distT="0" distB="0" distL="0" distR="0" wp14:anchorId="04E7DB61" wp14:editId="230FC192">
+            <wp:extent cx="5551805" cy="3299460"/>
+            <wp:effectExtent l="0" t="0" r="0" b="0"/>
+            <wp:docPr id="6" name="Рисунок 6"/>
+            <wp:cNvGraphicFramePr>
+              <a:graphicFrameLocks xmlns:a="http://schemas.openxmlformats.org/drawingml/2006/main" noChangeAspect="1"/>
+            </wp:cNvGraphicFramePr>
+            <a:graphic xmlns:a="http://schemas.openxmlformats.org/drawingml/2006/main">
+              <a:graphicData uri="http://schemas.openxmlformats.org/drawingml/2006/picture">
+                <pic:pic xmlns:pic="http://schemas.openxmlformats.org/drawingml/2006/picture">
+                  <pic:nvPicPr>
+                    <pic:cNvPr id="1" name=""/>
+                    <pic:cNvPicPr/>
+                  </pic:nvPicPr>
+                  <pic:blipFill rotWithShape="1">
+                    <a:blip r:embed="rId7"/>
+                    <a:srcRect b="2255"/>
+                    <a:stretch/>
+                  </pic:blipFill>
+                  <pic:spPr bwMode="auto">
+                    <a:xfrm>
+                      <a:off x="0" y="0"/>
+                      <a:ext cx="5557729" cy="3302981"/>
+                    </a:xfrm>
+                    <a:prstGeom prst="rect">
+                      <a:avLst/>
+                    </a:prstGeom>
+                    <a:ln>
+                      <a:noFill/>
+                    </a:ln>
+                    <a:extLst>
+                      <a:ext uri="{53640926-AAD7-44D8-BBD7-CCE9431645EC}">
+                        <a14:shadowObscured xmlns:a14="http://schemas.microsoft.com/office/drawing/2010/main"/>
+                      </a:ext>
+                    </a:extLst>
+                  </pic:spPr>
+                </pic:pic>
+              </a:graphicData>
+            </a:graphic>
+          </wp:inline>
+        </w:drawing>
+      </w:r>
+    </w:p>
+    <w:p>
+      <w:r>
+        <w:t>Продажи по месяцам</w:t>
       </w:r>
     </w:p>
     <w:sectPr>

</xml_diff>